<commit_message>
[Deepa Kushwaha] Add. AddressBook problem SonarQube report
</commit_message>
<xml_diff>
--- a/design-pattern-practice/gcr-codebase/SonarQube.docx
+++ b/design-pattern-practice/gcr-codebase/SonarQube.docx
@@ -417,13 +417,14 @@
       <w:r>
         <w:rPr>
           <w:rFonts w:ascii="Times New Roman" w:hAnsi="Times New Roman" w:cs="Times New Roman"/>
+          <w:noProof/>
           <w:sz w:val="28"/>
           <w:szCs w:val="28"/>
         </w:rPr>
         <w:drawing>
-          <wp:inline distT="0" distB="0" distL="0" distR="0" wp14:anchorId="39CD47ED" wp14:editId="2EE9E491">
-            <wp:extent cx="6480810" cy="3764280"/>
-            <wp:effectExtent l="0" t="0" r="0" b="7620"/>
+          <wp:inline distT="0" distB="0" distL="0" distR="0" wp14:anchorId="39CD47ED" wp14:editId="5B4B607B">
+            <wp:extent cx="6426200" cy="3764114"/>
+            <wp:effectExtent l="0" t="0" r="0" b="8255"/>
             <wp:docPr id="409879908" name="Picture 1"/>
             <wp:cNvGraphicFramePr>
               <a:graphicFrameLocks xmlns:a="http://schemas.openxmlformats.org/drawingml/2006/main" noChangeAspect="1"/>
@@ -432,11 +433,17 @@
               <a:graphicData uri="http://schemas.openxmlformats.org/drawingml/2006/picture">
                 <pic:pic xmlns:pic="http://schemas.openxmlformats.org/drawingml/2006/picture">
                   <pic:nvPicPr>
-                    <pic:cNvPr id="409879908" name=""/>
+                    <pic:cNvPr id="409879908" name="Picture 1"/>
                     <pic:cNvPicPr/>
                   </pic:nvPicPr>
                   <pic:blipFill>
-                    <a:blip r:embed="rId5"/>
+                    <a:blip r:embed="rId5">
+                      <a:extLst>
+                        <a:ext uri="{28A0092B-C50C-407E-A947-70E740481C1C}">
+                          <a14:useLocalDpi xmlns:a14="http://schemas.microsoft.com/office/drawing/2010/main" val="0"/>
+                        </a:ext>
+                      </a:extLst>
+                    </a:blip>
                     <a:stretch>
                       <a:fillRect/>
                     </a:stretch>
@@ -444,7 +451,7 @@
                   <pic:spPr>
                     <a:xfrm>
                       <a:off x="0" y="0"/>
-                      <a:ext cx="6480810" cy="3764280"/>
+                      <a:ext cx="6436098" cy="3769912"/>
                     </a:xfrm>
                     <a:prstGeom prst="rect">
                       <a:avLst/>
@@ -604,13 +611,14 @@
       <w:r>
         <w:rPr>
           <w:rFonts w:ascii="Times New Roman" w:hAnsi="Times New Roman" w:cs="Times New Roman"/>
+          <w:noProof/>
           <w:sz w:val="28"/>
           <w:szCs w:val="28"/>
         </w:rPr>
         <w:lastRenderedPageBreak/>
         <w:drawing>
-          <wp:inline distT="0" distB="0" distL="0" distR="0" wp14:anchorId="6525F61C" wp14:editId="4660C04A">
-            <wp:extent cx="6480810" cy="2782570"/>
+          <wp:inline distT="0" distB="0" distL="0" distR="0" wp14:anchorId="6525F61C" wp14:editId="1F693B96">
+            <wp:extent cx="6443980" cy="3340100"/>
             <wp:effectExtent l="0" t="0" r="0" b="0"/>
             <wp:docPr id="1779882711" name="Picture 1"/>
             <wp:cNvGraphicFramePr>
@@ -620,11 +628,17 @@
               <a:graphicData uri="http://schemas.openxmlformats.org/drawingml/2006/picture">
                 <pic:pic xmlns:pic="http://schemas.openxmlformats.org/drawingml/2006/picture">
                   <pic:nvPicPr>
-                    <pic:cNvPr id="1779882711" name=""/>
+                    <pic:cNvPr id="1779882711" name="Picture 1"/>
                     <pic:cNvPicPr/>
                   </pic:nvPicPr>
                   <pic:blipFill>
-                    <a:blip r:embed="rId6"/>
+                    <a:blip r:embed="rId6" cstate="print">
+                      <a:extLst>
+                        <a:ext uri="{28A0092B-C50C-407E-A947-70E740481C1C}">
+                          <a14:useLocalDpi xmlns:a14="http://schemas.microsoft.com/office/drawing/2010/main" val="0"/>
+                        </a:ext>
+                      </a:extLst>
+                    </a:blip>
                     <a:stretch>
                       <a:fillRect/>
                     </a:stretch>
@@ -632,7 +646,7 @@
                   <pic:spPr>
                     <a:xfrm>
                       <a:off x="0" y="0"/>
-                      <a:ext cx="6480810" cy="2782570"/>
+                      <a:ext cx="6460747" cy="3348791"/>
                     </a:xfrm>
                     <a:prstGeom prst="rect">
                       <a:avLst/>
@@ -669,12 +683,13 @@
       <w:r>
         <w:rPr>
           <w:rFonts w:ascii="Times New Roman" w:hAnsi="Times New Roman" w:cs="Times New Roman"/>
+          <w:noProof/>
           <w:sz w:val="28"/>
           <w:szCs w:val="28"/>
         </w:rPr>
         <w:drawing>
-          <wp:inline distT="0" distB="0" distL="0" distR="0" wp14:anchorId="4A3842AE" wp14:editId="48B18BA5">
-            <wp:extent cx="6480810" cy="2771140"/>
+          <wp:inline distT="0" distB="0" distL="0" distR="0" wp14:anchorId="4A3842AE" wp14:editId="0C6F2849">
+            <wp:extent cx="6425022" cy="3124200"/>
             <wp:effectExtent l="0" t="0" r="0" b="0"/>
             <wp:docPr id="1401291136" name="Picture 1"/>
             <wp:cNvGraphicFramePr>
@@ -684,11 +699,17 @@
               <a:graphicData uri="http://schemas.openxmlformats.org/drawingml/2006/picture">
                 <pic:pic xmlns:pic="http://schemas.openxmlformats.org/drawingml/2006/picture">
                   <pic:nvPicPr>
-                    <pic:cNvPr id="1401291136" name=""/>
+                    <pic:cNvPr id="1401291136" name="Picture 1"/>
                     <pic:cNvPicPr/>
                   </pic:nvPicPr>
                   <pic:blipFill>
-                    <a:blip r:embed="rId7"/>
+                    <a:blip r:embed="rId7" cstate="print">
+                      <a:extLst>
+                        <a:ext uri="{28A0092B-C50C-407E-A947-70E740481C1C}">
+                          <a14:useLocalDpi xmlns:a14="http://schemas.microsoft.com/office/drawing/2010/main" val="0"/>
+                        </a:ext>
+                      </a:extLst>
+                    </a:blip>
                     <a:stretch>
                       <a:fillRect/>
                     </a:stretch>
@@ -696,7 +717,7 @@
                   <pic:spPr>
                     <a:xfrm>
                       <a:off x="0" y="0"/>
-                      <a:ext cx="6480810" cy="2771140"/>
+                      <a:ext cx="6443745" cy="3133304"/>
                     </a:xfrm>
                     <a:prstGeom prst="rect">
                       <a:avLst/>
@@ -895,14 +916,15 @@
       <w:r>
         <w:rPr>
           <w:rFonts w:ascii="Times New Roman" w:hAnsi="Times New Roman" w:cs="Times New Roman"/>
+          <w:noProof/>
           <w:sz w:val="28"/>
           <w:szCs w:val="28"/>
         </w:rPr>
         <w:lastRenderedPageBreak/>
         <w:drawing>
-          <wp:inline distT="0" distB="0" distL="0" distR="0" wp14:anchorId="22EC53E5" wp14:editId="40023937">
-            <wp:extent cx="6480810" cy="3645535"/>
-            <wp:effectExtent l="0" t="0" r="0" b="0"/>
+          <wp:inline distT="0" distB="0" distL="0" distR="0" wp14:anchorId="22EC53E5" wp14:editId="000CF712">
+            <wp:extent cx="6480810" cy="3402425"/>
+            <wp:effectExtent l="0" t="0" r="0" b="7620"/>
             <wp:docPr id="229480112" name="Picture 1"/>
             <wp:cNvGraphicFramePr>
               <a:graphicFrameLocks xmlns:a="http://schemas.openxmlformats.org/drawingml/2006/main" noChangeAspect="1"/>
@@ -911,11 +933,17 @@
               <a:graphicData uri="http://schemas.openxmlformats.org/drawingml/2006/picture">
                 <pic:pic xmlns:pic="http://schemas.openxmlformats.org/drawingml/2006/picture">
                   <pic:nvPicPr>
-                    <pic:cNvPr id="229480112" name=""/>
+                    <pic:cNvPr id="229480112" name="Picture 1"/>
                     <pic:cNvPicPr/>
                   </pic:nvPicPr>
                   <pic:blipFill>
-                    <a:blip r:embed="rId9"/>
+                    <a:blip r:embed="rId9" cstate="print">
+                      <a:extLst>
+                        <a:ext uri="{28A0092B-C50C-407E-A947-70E740481C1C}">
+                          <a14:useLocalDpi xmlns:a14="http://schemas.microsoft.com/office/drawing/2010/main" val="0"/>
+                        </a:ext>
+                      </a:extLst>
+                    </a:blip>
                     <a:stretch>
                       <a:fillRect/>
                     </a:stretch>
@@ -923,7 +951,7 @@
                   <pic:spPr>
                     <a:xfrm>
                       <a:off x="0" y="0"/>
-                      <a:ext cx="6480810" cy="3645535"/>
+                      <a:ext cx="6480810" cy="3402425"/>
                     </a:xfrm>
                     <a:prstGeom prst="rect">
                       <a:avLst/>
@@ -1111,27 +1139,15 @@
         </w:rPr>
         <w:t xml:space="preserve"> </w:t>
       </w:r>
-      <w:proofErr w:type="spellStart"/>
-      <w:r>
-        <w:rPr>
-          <w:rFonts w:ascii="Times New Roman" w:hAnsi="Times New Roman" w:cs="Times New Roman"/>
-          <w:b/>
-          <w:bCs/>
-          <w:sz w:val="28"/>
-          <w:szCs w:val="28"/>
-        </w:rPr>
-        <w:t>sonarqube</w:t>
-      </w:r>
-      <w:proofErr w:type="spellEnd"/>
-      <w:r>
-        <w:rPr>
-          <w:rFonts w:ascii="Times New Roman" w:hAnsi="Times New Roman" w:cs="Times New Roman"/>
-          <w:b/>
-          <w:bCs/>
-          <w:sz w:val="28"/>
-          <w:szCs w:val="28"/>
-        </w:rPr>
-        <w:t>\bin\windows-x86-64\</w:t>
+      <w:r>
+        <w:rPr>
+          <w:rFonts w:ascii="Times New Roman" w:hAnsi="Times New Roman" w:cs="Times New Roman"/>
+          <w:b/>
+          <w:bCs/>
+          <w:sz w:val="28"/>
+          <w:szCs w:val="28"/>
+        </w:rPr>
+        <w:t>sonarqube\bin\windows-x86-64\</w:t>
       </w:r>
     </w:p>
     <w:p>
@@ -1455,7 +1471,37 @@
           <w:sz w:val="28"/>
           <w:szCs w:val="28"/>
         </w:rPr>
-        <w:t>address-book</w:t>
+        <w:t>A</w:t>
+      </w:r>
+      <w:r>
+        <w:rPr>
+          <w:rFonts w:ascii="Times New Roman" w:hAnsi="Times New Roman" w:cs="Times New Roman"/>
+          <w:b/>
+          <w:bCs/>
+          <w:sz w:val="28"/>
+          <w:szCs w:val="28"/>
+        </w:rPr>
+        <w:t>ddress-</w:t>
+      </w:r>
+      <w:r>
+        <w:rPr>
+          <w:rFonts w:ascii="Times New Roman" w:hAnsi="Times New Roman" w:cs="Times New Roman"/>
+          <w:b/>
+          <w:bCs/>
+          <w:sz w:val="28"/>
+          <w:szCs w:val="28"/>
+        </w:rPr>
+        <w:t>B</w:t>
+      </w:r>
+      <w:r>
+        <w:rPr>
+          <w:rFonts w:ascii="Times New Roman" w:hAnsi="Times New Roman" w:cs="Times New Roman"/>
+          <w:b/>
+          <w:bCs/>
+          <w:sz w:val="28"/>
+          <w:szCs w:val="28"/>
+        </w:rPr>
+        <w:t>ook</w:t>
       </w:r>
     </w:p>
     <w:p>
@@ -1832,7 +1878,7 @@
         <mc:AlternateContent>
           <mc:Choice Requires="wps">
             <w:drawing>
-              <wp:anchor distT="0" distB="0" distL="114300" distR="114300" simplePos="0" relativeHeight="251659264" behindDoc="0" locked="0" layoutInCell="1" allowOverlap="1">
+              <wp:anchor distT="0" distB="0" distL="114300" distR="114300" simplePos="0" relativeHeight="251659264" behindDoc="0" locked="0" layoutInCell="1" allowOverlap="1" wp14:anchorId="3E625E8D" wp14:editId="5ED20A48">
                 <wp:simplePos x="0" y="0"/>
                 <wp:positionH relativeFrom="column">
                   <wp:posOffset>402874</wp:posOffset>
@@ -1893,9 +1939,8 @@
                                 <w:sz w:val="24"/>
                                 <w:szCs w:val="24"/>
                               </w:rPr>
-                              <w:t>sonar-scanner.bat -</w:t>
+                              <w:t>sonar-scanner.bat -D"sonar.projectKey=</w:t>
                             </w:r>
-                            <w:proofErr w:type="spellStart"/>
                             <w:r>
                               <w:rPr>
                                 <w:rFonts w:ascii="Times New Roman" w:hAnsi="Times New Roman" w:cs="Times New Roman"/>
@@ -1904,9 +1949,8 @@
                                 <w:sz w:val="24"/>
                                 <w:szCs w:val="24"/>
                               </w:rPr>
-                              <w:t>D"</w:t>
+                              <w:t>A</w:t>
                             </w:r>
-                            <w:proofErr w:type="gramStart"/>
                             <w:r>
                               <w:rPr>
                                 <w:rFonts w:ascii="Times New Roman" w:hAnsi="Times New Roman" w:cs="Times New Roman"/>
@@ -1915,10 +1959,8 @@
                                 <w:sz w:val="24"/>
                                 <w:szCs w:val="24"/>
                               </w:rPr>
-                              <w:t>sonar.projectKey</w:t>
+                              <w:t>ddress-</w:t>
                             </w:r>
-                            <w:proofErr w:type="spellEnd"/>
-                            <w:proofErr w:type="gramEnd"/>
                             <w:r>
                               <w:rPr>
                                 <w:rFonts w:ascii="Times New Roman" w:hAnsi="Times New Roman" w:cs="Times New Roman"/>
@@ -1927,9 +1969,8 @@
                                 <w:sz w:val="24"/>
                                 <w:szCs w:val="24"/>
                               </w:rPr>
-                              <w:t>=address-book" -</w:t>
+                              <w:t>B</w:t>
                             </w:r>
-                            <w:proofErr w:type="spellStart"/>
                             <w:r>
                               <w:rPr>
                                 <w:rFonts w:ascii="Times New Roman" w:hAnsi="Times New Roman" w:cs="Times New Roman"/>
@@ -1938,120 +1979,7 @@
                                 <w:sz w:val="24"/>
                                 <w:szCs w:val="24"/>
                               </w:rPr>
-                              <w:t>D"</w:t>
-                            </w:r>
-                            <w:proofErr w:type="gramStart"/>
-                            <w:r>
-                              <w:rPr>
-                                <w:rFonts w:ascii="Times New Roman" w:hAnsi="Times New Roman" w:cs="Times New Roman"/>
-                                <w:b/>
-                                <w:bCs/>
-                                <w:sz w:val="24"/>
-                                <w:szCs w:val="24"/>
-                              </w:rPr>
-                              <w:t>sonar.sources</w:t>
-                            </w:r>
-                            <w:proofErr w:type="spellEnd"/>
-                            <w:proofErr w:type="gramEnd"/>
-                            <w:r>
-                              <w:rPr>
-                                <w:rFonts w:ascii="Times New Roman" w:hAnsi="Times New Roman" w:cs="Times New Roman"/>
-                                <w:b/>
-                                <w:bCs/>
-                                <w:sz w:val="24"/>
-                                <w:szCs w:val="24"/>
-                              </w:rPr>
-                              <w:t>=src" -</w:t>
-                            </w:r>
-                            <w:proofErr w:type="spellStart"/>
-                            <w:r>
-                              <w:rPr>
-                                <w:rFonts w:ascii="Times New Roman" w:hAnsi="Times New Roman" w:cs="Times New Roman"/>
-                                <w:b/>
-                                <w:bCs/>
-                                <w:sz w:val="24"/>
-                                <w:szCs w:val="24"/>
-                              </w:rPr>
-                              <w:t>D"</w:t>
-                            </w:r>
-                            <w:proofErr w:type="gramStart"/>
-                            <w:r>
-                              <w:rPr>
-                                <w:rFonts w:ascii="Times New Roman" w:hAnsi="Times New Roman" w:cs="Times New Roman"/>
-                                <w:b/>
-                                <w:bCs/>
-                                <w:sz w:val="24"/>
-                                <w:szCs w:val="24"/>
-                              </w:rPr>
-                              <w:t>sonar.java.binaries</w:t>
-                            </w:r>
-                            <w:proofErr w:type="spellEnd"/>
-                            <w:proofErr w:type="gramEnd"/>
-                            <w:r>
-                              <w:rPr>
-                                <w:rFonts w:ascii="Times New Roman" w:hAnsi="Times New Roman" w:cs="Times New Roman"/>
-                                <w:b/>
-                                <w:bCs/>
-                                <w:sz w:val="24"/>
-                                <w:szCs w:val="24"/>
-                              </w:rPr>
-                              <w:t>=bin" -</w:t>
-                            </w:r>
-                            <w:proofErr w:type="spellStart"/>
-                            <w:r>
-                              <w:rPr>
-                                <w:rFonts w:ascii="Times New Roman" w:hAnsi="Times New Roman" w:cs="Times New Roman"/>
-                                <w:b/>
-                                <w:bCs/>
-                                <w:sz w:val="24"/>
-                                <w:szCs w:val="24"/>
-                              </w:rPr>
-                              <w:t>D"sonar.host.url</w:t>
-                            </w:r>
-                            <w:proofErr w:type="spellEnd"/>
-                            <w:r>
-                              <w:rPr>
-                                <w:rFonts w:ascii="Times New Roman" w:hAnsi="Times New Roman" w:cs="Times New Roman"/>
-                                <w:b/>
-                                <w:bCs/>
-                                <w:sz w:val="24"/>
-                                <w:szCs w:val="24"/>
-                              </w:rPr>
-                              <w:t>=http://localhost:9000" -</w:t>
-                            </w:r>
-                            <w:proofErr w:type="spellStart"/>
-                            <w:r>
-                              <w:rPr>
-                                <w:rFonts w:ascii="Times New Roman" w:hAnsi="Times New Roman" w:cs="Times New Roman"/>
-                                <w:b/>
-                                <w:bCs/>
-                                <w:sz w:val="24"/>
-                                <w:szCs w:val="24"/>
-                              </w:rPr>
-                              <w:t>D"</w:t>
-                            </w:r>
-                            <w:proofErr w:type="gramStart"/>
-                            <w:r>
-                              <w:rPr>
-                                <w:rFonts w:ascii="Times New Roman" w:hAnsi="Times New Roman" w:cs="Times New Roman"/>
-                                <w:b/>
-                                <w:bCs/>
-                                <w:sz w:val="24"/>
-                                <w:szCs w:val="24"/>
-                              </w:rPr>
-                              <w:t>sonar.token</w:t>
-                            </w:r>
-                            <w:proofErr w:type="spellEnd"/>
-                            <w:proofErr w:type="gramEnd"/>
-                            <w:r>
-                              <w:rPr>
-                                <w:rFonts w:ascii="Times New Roman" w:hAnsi="Times New Roman" w:cs="Times New Roman"/>
-                                <w:b/>
-                                <w:bCs/>
-                                <w:sz w:val="24"/>
-                                <w:szCs w:val="24"/>
-                              </w:rPr>
-                              <w:t>=TOKEN"</w:t>
+                              <w:t>ook" -D"sonar.sources=src" -D"sonar.java.binaries=bin" -D"sonar.host.url=http://localhost:9000" -D"sonar.token=TOKEN"</w:t>
                             </w:r>
                           </w:p>
                         </w:txbxContent>
@@ -2076,7 +2004,7 @@
           </mc:Choice>
           <mc:Fallback>
             <w:pict>
-              <v:rect id="Rectangle 1" o:spid="_x0000_s1026" style="position:absolute;left:0;text-align:left;margin-left:31.7pt;margin-top:21.55pt;width:422.05pt;height:56.7pt;z-index:251659264;visibility:visible;mso-wrap-style:square;mso-width-percent:0;mso-height-percent:0;mso-wrap-distance-left:9pt;mso-wrap-distance-top:0;mso-wrap-distance-right:9pt;mso-wrap-distance-bottom:0;mso-position-horizontal:absolute;mso-position-horizontal-relative:text;mso-position-vertical:absolute;mso-position-vertical-relative:text;mso-width-percent:0;mso-height-percent:0;mso-width-relative:margin;mso-height-relative:margin;v-text-anchor:middle" o:gfxdata="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" fillcolor="white [3201]" strokecolor="black [3200]" strokeweight="1pt">
+              <v:rect w14:anchorId="3E625E8D" id="Rectangle 1" o:spid="_x0000_s1026" style="position:absolute;left:0;text-align:left;margin-left:31.7pt;margin-top:21.55pt;width:422.05pt;height:56.7pt;z-index:251659264;visibility:visible;mso-wrap-style:square;mso-width-percent:0;mso-height-percent:0;mso-wrap-distance-left:9pt;mso-wrap-distance-top:0;mso-wrap-distance-right:9pt;mso-wrap-distance-bottom:0;mso-position-horizontal:absolute;mso-position-horizontal-relative:text;mso-position-vertical:absolute;mso-position-vertical-relative:text;mso-width-percent:0;mso-height-percent:0;mso-width-relative:margin;mso-height-relative:margin;v-text-anchor:middle" o:gfxdata="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" fillcolor="white [3201]" strokecolor="black [3200]" strokeweight="1pt">
                 <v:textbox>
                   <w:txbxContent>
                     <w:p>
@@ -2098,9 +2026,8 @@
                           <w:sz w:val="24"/>
                           <w:szCs w:val="24"/>
                         </w:rPr>
-                        <w:t>sonar-scanner.bat -</w:t>
+                        <w:t>sonar-scanner.bat -D"sonar.projectKey=</w:t>
                       </w:r>
-                      <w:proofErr w:type="spellStart"/>
                       <w:r>
                         <w:rPr>
                           <w:rFonts w:ascii="Times New Roman" w:hAnsi="Times New Roman" w:cs="Times New Roman"/>
@@ -2109,9 +2036,8 @@
                           <w:sz w:val="24"/>
                           <w:szCs w:val="24"/>
                         </w:rPr>
-                        <w:t>D"</w:t>
+                        <w:t>A</w:t>
                       </w:r>
-                      <w:proofErr w:type="gramStart"/>
                       <w:r>
                         <w:rPr>
                           <w:rFonts w:ascii="Times New Roman" w:hAnsi="Times New Roman" w:cs="Times New Roman"/>
@@ -2120,10 +2046,8 @@
                           <w:sz w:val="24"/>
                           <w:szCs w:val="24"/>
                         </w:rPr>
-                        <w:t>sonar.projectKey</w:t>
+                        <w:t>ddress-</w:t>
                       </w:r>
-                      <w:proofErr w:type="spellEnd"/>
-                      <w:proofErr w:type="gramEnd"/>
                       <w:r>
                         <w:rPr>
                           <w:rFonts w:ascii="Times New Roman" w:hAnsi="Times New Roman" w:cs="Times New Roman"/>
@@ -2132,9 +2056,8 @@
                           <w:sz w:val="24"/>
                           <w:szCs w:val="24"/>
                         </w:rPr>
-                        <w:t>=address-book" -</w:t>
+                        <w:t>B</w:t>
                       </w:r>
-                      <w:proofErr w:type="spellStart"/>
                       <w:r>
                         <w:rPr>
                           <w:rFonts w:ascii="Times New Roman" w:hAnsi="Times New Roman" w:cs="Times New Roman"/>
@@ -2143,120 +2066,7 @@
                           <w:sz w:val="24"/>
                           <w:szCs w:val="24"/>
                         </w:rPr>
-                        <w:t>D"</w:t>
-                      </w:r>
-                      <w:proofErr w:type="gramStart"/>
-                      <w:r>
-                        <w:rPr>
-                          <w:rFonts w:ascii="Times New Roman" w:hAnsi="Times New Roman" w:cs="Times New Roman"/>
-                          <w:b/>
-                          <w:bCs/>
-                          <w:sz w:val="24"/>
-                          <w:szCs w:val="24"/>
-                        </w:rPr>
-                        <w:t>sonar.sources</w:t>
-                      </w:r>
-                      <w:proofErr w:type="spellEnd"/>
-                      <w:proofErr w:type="gramEnd"/>
-                      <w:r>
-                        <w:rPr>
-                          <w:rFonts w:ascii="Times New Roman" w:hAnsi="Times New Roman" w:cs="Times New Roman"/>
-                          <w:b/>
-                          <w:bCs/>
-                          <w:sz w:val="24"/>
-                          <w:szCs w:val="24"/>
-                        </w:rPr>
-                        <w:t>=src" -</w:t>
-                      </w:r>
-                      <w:proofErr w:type="spellStart"/>
-                      <w:r>
-                        <w:rPr>
-                          <w:rFonts w:ascii="Times New Roman" w:hAnsi="Times New Roman" w:cs="Times New Roman"/>
-                          <w:b/>
-                          <w:bCs/>
-                          <w:sz w:val="24"/>
-                          <w:szCs w:val="24"/>
-                        </w:rPr>
-                        <w:t>D"</w:t>
-                      </w:r>
-                      <w:proofErr w:type="gramStart"/>
-                      <w:r>
-                        <w:rPr>
-                          <w:rFonts w:ascii="Times New Roman" w:hAnsi="Times New Roman" w:cs="Times New Roman"/>
-                          <w:b/>
-                          <w:bCs/>
-                          <w:sz w:val="24"/>
-                          <w:szCs w:val="24"/>
-                        </w:rPr>
-                        <w:t>sonar.java.binaries</w:t>
-                      </w:r>
-                      <w:proofErr w:type="spellEnd"/>
-                      <w:proofErr w:type="gramEnd"/>
-                      <w:r>
-                        <w:rPr>
-                          <w:rFonts w:ascii="Times New Roman" w:hAnsi="Times New Roman" w:cs="Times New Roman"/>
-                          <w:b/>
-                          <w:bCs/>
-                          <w:sz w:val="24"/>
-                          <w:szCs w:val="24"/>
-                        </w:rPr>
-                        <w:t>=bin" -</w:t>
-                      </w:r>
-                      <w:proofErr w:type="spellStart"/>
-                      <w:r>
-                        <w:rPr>
-                          <w:rFonts w:ascii="Times New Roman" w:hAnsi="Times New Roman" w:cs="Times New Roman"/>
-                          <w:b/>
-                          <w:bCs/>
-                          <w:sz w:val="24"/>
-                          <w:szCs w:val="24"/>
-                        </w:rPr>
-                        <w:t>D"sonar.host.url</w:t>
-                      </w:r>
-                      <w:proofErr w:type="spellEnd"/>
-                      <w:r>
-                        <w:rPr>
-                          <w:rFonts w:ascii="Times New Roman" w:hAnsi="Times New Roman" w:cs="Times New Roman"/>
-                          <w:b/>
-                          <w:bCs/>
-                          <w:sz w:val="24"/>
-                          <w:szCs w:val="24"/>
-                        </w:rPr>
-                        <w:t>=http://localhost:9000" -</w:t>
-                      </w:r>
-                      <w:proofErr w:type="spellStart"/>
-                      <w:r>
-                        <w:rPr>
-                          <w:rFonts w:ascii="Times New Roman" w:hAnsi="Times New Roman" w:cs="Times New Roman"/>
-                          <w:b/>
-                          <w:bCs/>
-                          <w:sz w:val="24"/>
-                          <w:szCs w:val="24"/>
-                        </w:rPr>
-                        <w:t>D"</w:t>
-                      </w:r>
-                      <w:proofErr w:type="gramStart"/>
-                      <w:r>
-                        <w:rPr>
-                          <w:rFonts w:ascii="Times New Roman" w:hAnsi="Times New Roman" w:cs="Times New Roman"/>
-                          <w:b/>
-                          <w:bCs/>
-                          <w:sz w:val="24"/>
-                          <w:szCs w:val="24"/>
-                        </w:rPr>
-                        <w:t>sonar.token</w:t>
-                      </w:r>
-                      <w:proofErr w:type="spellEnd"/>
-                      <w:proofErr w:type="gramEnd"/>
-                      <w:r>
-                        <w:rPr>
-                          <w:rFonts w:ascii="Times New Roman" w:hAnsi="Times New Roman" w:cs="Times New Roman"/>
-                          <w:b/>
-                          <w:bCs/>
-                          <w:sz w:val="24"/>
-                          <w:szCs w:val="24"/>
-                        </w:rPr>
-                        <w:t>=TOKEN"</w:t>
+                        <w:t>ook" -D"sonar.sources=src" -D"sonar.java.binaries=bin" -D"sonar.host.url=http://localhost:9000" -D"sonar.token=TOKEN"</w:t>
                       </w:r>
                     </w:p>
                   </w:txbxContent>
@@ -3369,7 +3179,17 @@
           <w:sz w:val="28"/>
           <w:szCs w:val="28"/>
         </w:rPr>
-        <w:t>77 Code Smells</w:t>
+        <w:t>86</w:t>
+      </w:r>
+      <w:r>
+        <w:rPr>
+          <w:rFonts w:ascii="Times New Roman" w:hAnsi="Times New Roman" w:cs="Times New Roman"/>
+          <w:b/>
+          <w:bCs/>
+          <w:sz w:val="28"/>
+          <w:szCs w:val="28"/>
+        </w:rPr>
+        <w:t xml:space="preserve"> Code Smells</w:t>
       </w:r>
     </w:p>
     <w:p>
@@ -6107,6 +5927,7 @@
   <w:style w:type="character" w:default="1" w:styleId="DefaultParagraphFont">
     <w:name w:val="Default Paragraph Font"/>
     <w:uiPriority w:val="1"/>
+    <w:semiHidden/>
     <w:unhideWhenUsed/>
   </w:style>
   <w:style w:type="table" w:default="1" w:styleId="TableNormal">

</xml_diff>